<commit_message>
Add 4.7 Discussion of Findings to Chapter Four
Discuss the study's findings against each of the four research questions
from Chapter One, placed after 4.6 Exhibition and before Chapter Five.

Co-Authored-By: Claude Opus 4.8 <noreply@anthropic.com>
Claude-Session: https://claude.ai/code/session_01VxYDM9saceacs3Krk2xAWJ
</commit_message>
<xml_diff>
--- a/Muhees_Project_with_Chapters_4_and_5.docx
+++ b/Muhees_Project_with_Chapters_4_and_5.docx
@@ -6812,6 +6812,128 @@
           <w:bCs/>
         </w:rPr>
         <w:t xml:space="preserve">Plate V: The finished work on display at the exhibition</w:t>
+      </w:r>
+    </w:p>
+    <w:p>
+      <w:pPr>
+        <w:pStyle w:val="NormalWeb"/>
+        <w:shd w:val="clear" w:color="auto" w:fill="FFFFFF"/>
+        <w:spacing w:after="240" w:line="480" w:lineRule="auto"/>
+        <w:jc w:val="both"/>
+        <w:textAlignment w:val="baseline"/>
+        <w:rPr>
+          <w:b/>
+          <w:bCs/>
+        </w:rPr>
+      </w:pPr>
+      <w:r>
+        <w:rPr>
+          <w:b/>
+          <w:bCs/>
+        </w:rPr>
+        <w:t xml:space="preserve">4.7 </w:t>
+        <w:tab/>
+        <w:t xml:space="preserve">Discussion of Findings</w:t>
+      </w:r>
+    </w:p>
+    <w:p>
+      <w:pPr>
+        <w:pStyle w:val="NormalWeb"/>
+        <w:shd w:val="clear" w:color="auto" w:fill="FFFFFF"/>
+        <w:spacing w:after="240" w:line="480" w:lineRule="auto"/>
+        <w:jc w:val="both"/>
+        <w:textAlignment w:val="baseline"/>
+      </w:pPr>
+      <w:r>
+        <w:t xml:space="preserve">The study was guided by four research questions. The findings from the studio practice are discussed against each question below.</w:t>
+      </w:r>
+    </w:p>
+    <w:p>
+      <w:pPr>
+        <w:pStyle w:val="NormalWeb"/>
+        <w:shd w:val="clear" w:color="auto" w:fill="FFFFFF"/>
+        <w:spacing w:after="240" w:line="480" w:lineRule="auto"/>
+        <w:jc w:val="both"/>
+        <w:textAlignment w:val="baseline"/>
+      </w:pPr>
+      <w:r>
+        <w:rPr>
+          <w:b/>
+          <w:bCs/>
+        </w:rPr>
+        <w:t xml:space="preserve">Research Question One: </w:t>
+      </w:r>
+      <w:r>
+        <w:t xml:space="preserve">The first question asked if the Yorùbá talking drum would be documented through art in a way that preserves its cultural significance for future generations. The finished painting answers this question. The work records the form of the drum, the posture of the drummer and the response of the people around the sound. By fixing these in paint and fabric on canvas, the study turned a living practice into a lasting visual record. The painting now stands as a reference other viewers and researchers are able to return to, which preserves the meaning of the drum beyond the memory of those who play it.</w:t>
+      </w:r>
+    </w:p>
+    <w:p>
+      <w:pPr>
+        <w:pStyle w:val="NormalWeb"/>
+        <w:shd w:val="clear" w:color="auto" w:fill="FFFFFF"/>
+        <w:spacing w:after="240" w:line="480" w:lineRule="auto"/>
+        <w:jc w:val="both"/>
+        <w:textAlignment w:val="baseline"/>
+      </w:pPr>
+      <w:r>
+        <w:rPr>
+          <w:b/>
+          <w:bCs/>
+        </w:rPr>
+        <w:t xml:space="preserve">Research Question Two: </w:t>
+      </w:r>
+      <w:r>
+        <w:t xml:space="preserve">The second question asked if thumbnail sketches depicting the Yorùbá talking drum would be developed. The study produced three thumbnail sketches of the drum and its players, shown in Plate II. The sketches tested different arrangements of the figures and the drum before the final choice was made, and they served as the planning stage of the work. Their success showed the drum lends itself to clear composition in sketch form, so the second question is answered in the affirmative.</w:t>
+      </w:r>
+    </w:p>
+    <w:p>
+      <w:pPr>
+        <w:pStyle w:val="NormalWeb"/>
+        <w:shd w:val="clear" w:color="auto" w:fill="FFFFFF"/>
+        <w:spacing w:after="240" w:line="480" w:lineRule="auto"/>
+        <w:jc w:val="both"/>
+        <w:textAlignment w:val="baseline"/>
+      </w:pPr>
+      <w:r>
+        <w:rPr>
+          <w:b/>
+          <w:bCs/>
+        </w:rPr>
+        <w:t xml:space="preserve">Research Question Three: </w:t>
+      </w:r>
+      <w:r>
+        <w:t xml:space="preserve">The third question asked if mixed media of fabric and acrylic would serve as a technique for portraying the vibrant and dynamic atmosphere of the Yorùbá talking drum. The joining of Yorùbá fabric with acrylic paint carried the vibrancy of the subject. The printed and woven cloth brought real pattern and colour into the work, while the impasto acrylic raised the drum and the hands and caught the light. The two materials together gave the scene a dynamic, textured surface a single medium would not reach. This finding confirms fabric and acrylic work well as a mixed media technique for the subject.</w:t>
+      </w:r>
+    </w:p>
+    <w:p>
+      <w:pPr>
+        <w:pStyle w:val="NormalWeb"/>
+        <w:shd w:val="clear" w:color="auto" w:fill="FFFFFF"/>
+        <w:spacing w:after="240" w:line="480" w:lineRule="auto"/>
+        <w:jc w:val="both"/>
+        <w:textAlignment w:val="baseline"/>
+      </w:pPr>
+      <w:r>
+        <w:rPr>
+          <w:b/>
+          <w:bCs/>
+        </w:rPr>
+        <w:t xml:space="preserve">Research Question Four: </w:t>
+      </w:r>
+      <w:r>
+        <w:t xml:space="preserve">The fourth question asked if the outcome of the Yorùbá talking drum in mixed media of fabric and acrylic would be exhibited. The finished work was shown with the works of other final year students in the Department of Fine and Applied Arts, as recorded in Section 4.6. Viewers engaged with the painting and asked about the drum and the method used to produce it. The exhibition answered the fourth question and showed the work reaches an audience and raises awareness of both the instrument and the technique.</w:t>
+      </w:r>
+    </w:p>
+    <w:p>
+      <w:pPr>
+        <w:pStyle w:val="NormalWeb"/>
+        <w:shd w:val="clear" w:color="auto" w:fill="FFFFFF"/>
+        <w:spacing w:after="240" w:line="480" w:lineRule="auto"/>
+        <w:jc w:val="both"/>
+        <w:textAlignment w:val="baseline"/>
+      </w:pPr>
+      <w:r>
+        <w:t xml:space="preserve">The four findings together show the aim of the study, to produce a painting that documents the Yorùbá talking drum using mixed media of fabric and acrylic, was met.</w:t>
       </w:r>
     </w:p>
     <w:p>

</xml_diff>